<commit_message>
Ajustes en las actas de formacion para incluir el nombre del formador, supervisor y departamento. Ademas, se ha añadido un mensaje de introducción en el examen teórico para informar al operario sobre el porcentaje mínimo para aprobar.
</commit_message>
<xml_diff>
--- a/media/plantillas/teoria/respuestas/Respuestas Evaluación C&T.docx
+++ b/media/plantillas/teoria/respuestas/Respuestas Evaluación C&T.docx
@@ -428,7 +428,7 @@
         </w:numPr>
       </w:pPr>
       <w:r>
-        <w:t>Soy yo responsable de que todos los productos que utilizo no est</w:t>
+        <w:t>Soy yo supervisor de que todos los productos que utilizo no est</w:t>
       </w:r>
       <w:r>
         <w:t>é</w:t>
@@ -476,7 +476,7 @@
         </w:numPr>
       </w:pPr>
       <w:r>
-        <w:t>El responsable es el supervisor.</w:t>
+        <w:t>El supervisor es el supervisor.</w:t>
       </w:r>
     </w:p>
     <w:p>

</xml_diff>